<commit_message>
Add periodic auto scan
</commit_message>
<xml_diff>
--- a/doc/使用说明书.docx
+++ b/doc/使用说明书.docx
@@ -1678,6 +1678,56 @@
                 <w:sz w:val="19"/>
               </w:rPr>
               <w:t>选择 Foxmail 程序、邮箱本地目录、设置开机自启</w:t>
+            </w:r>
+          </w:p>
+        </w:tc>
+      </w:tr>
+      <w:tr>
+        <w:tc>
+          <w:tcPr>
+            <w:tcW w:type="dxa" w:w="4896"/>
+            <w:vAlign w:val="center"/>
+            <w:tcMar>
+              <w:top w:w="80" w:type="dxa"/>
+              <w:start w:w="120" w:type="dxa"/>
+              <w:bottom w:w="80" w:type="dxa"/>
+              <w:end w:w="120" w:type="dxa"/>
+            </w:tcMar>
+          </w:tcPr>
+          <w:p>
+            <w:pPr>
+              <w:spacing w:after="0"/>
+            </w:pPr>
+            <w:r>
+              <w:rPr>
+                <w:rFonts w:ascii="Microsoft YaHei UI" w:hAnsi="Microsoft YaHei UI" w:eastAsia="Microsoft YaHei UI"/>
+                <w:sz w:val="19"/>
+              </w:rPr>
+              <w:t>系统设置</w:t>
+            </w:r>
+          </w:p>
+        </w:tc>
+        <w:tc>
+          <w:tcPr>
+            <w:tcW w:type="dxa" w:w="4896"/>
+            <w:vAlign w:val="center"/>
+            <w:tcMar>
+              <w:top w:w="80" w:type="dxa"/>
+              <w:start w:w="120" w:type="dxa"/>
+              <w:bottom w:w="80" w:type="dxa"/>
+              <w:end w:w="120" w:type="dxa"/>
+            </w:tcMar>
+          </w:tcPr>
+          <w:p>
+            <w:pPr>
+              <w:spacing w:after="0"/>
+            </w:pPr>
+            <w:r>
+              <w:rPr>
+                <w:rFonts w:ascii="Microsoft YaHei UI" w:hAnsi="Microsoft YaHei UI" w:eastAsia="Microsoft YaHei UI"/>
+                <w:sz w:val="19"/>
+              </w:rPr>
+              <w:t>开启自动扫描、设置扫描间隔</w:t>
             </w:r>
           </w:p>
         </w:tc>
@@ -4147,6 +4197,106 @@
           </w:p>
         </w:tc>
       </w:tr>
+      <w:tr>
+        <w:tc>
+          <w:tcPr>
+            <w:tcW w:type="dxa" w:w="4896"/>
+            <w:vAlign w:val="center"/>
+            <w:tcMar>
+              <w:top w:w="80" w:type="dxa"/>
+              <w:start w:w="120" w:type="dxa"/>
+              <w:bottom w:w="80" w:type="dxa"/>
+              <w:end w:w="120" w:type="dxa"/>
+            </w:tcMar>
+          </w:tcPr>
+          <w:p>
+            <w:pPr>
+              <w:spacing w:after="0"/>
+            </w:pPr>
+            <w:r>
+              <w:rPr>
+                <w:rFonts w:ascii="Microsoft YaHei UI" w:hAnsi="Microsoft YaHei UI" w:eastAsia="Microsoft YaHei UI"/>
+                <w:sz w:val="19"/>
+              </w:rPr>
+              <w:t>自动扫描客户文件夹</w:t>
+            </w:r>
+          </w:p>
+        </w:tc>
+        <w:tc>
+          <w:tcPr>
+            <w:tcW w:type="dxa" w:w="4896"/>
+            <w:vAlign w:val="center"/>
+            <w:tcMar>
+              <w:top w:w="80" w:type="dxa"/>
+              <w:start w:w="120" w:type="dxa"/>
+              <w:bottom w:w="80" w:type="dxa"/>
+              <w:end w:w="120" w:type="dxa"/>
+            </w:tcMar>
+          </w:tcPr>
+          <w:p>
+            <w:pPr>
+              <w:spacing w:after="0"/>
+            </w:pPr>
+            <w:r>
+              <w:rPr>
+                <w:rFonts w:ascii="Microsoft YaHei UI" w:hAnsi="Microsoft YaHei UI" w:eastAsia="Microsoft YaHei UI"/>
+                <w:sz w:val="19"/>
+              </w:rPr>
+              <w:t>勾选后，程序会定时扫描客户 Excel 文件夹</w:t>
+            </w:r>
+          </w:p>
+        </w:tc>
+      </w:tr>
+      <w:tr>
+        <w:tc>
+          <w:tcPr>
+            <w:tcW w:type="dxa" w:w="4896"/>
+            <w:vAlign w:val="center"/>
+            <w:tcMar>
+              <w:top w:w="80" w:type="dxa"/>
+              <w:start w:w="120" w:type="dxa"/>
+              <w:bottom w:w="80" w:type="dxa"/>
+              <w:end w:w="120" w:type="dxa"/>
+            </w:tcMar>
+          </w:tcPr>
+          <w:p>
+            <w:pPr>
+              <w:spacing w:after="0"/>
+            </w:pPr>
+            <w:r>
+              <w:rPr>
+                <w:rFonts w:ascii="Microsoft YaHei UI" w:hAnsi="Microsoft YaHei UI" w:eastAsia="Microsoft YaHei UI"/>
+                <w:sz w:val="19"/>
+              </w:rPr>
+              <w:t>扫描间隔秒数</w:t>
+            </w:r>
+          </w:p>
+        </w:tc>
+        <w:tc>
+          <w:tcPr>
+            <w:tcW w:type="dxa" w:w="4896"/>
+            <w:vAlign w:val="center"/>
+            <w:tcMar>
+              <w:top w:w="80" w:type="dxa"/>
+              <w:start w:w="120" w:type="dxa"/>
+              <w:bottom w:w="80" w:type="dxa"/>
+              <w:end w:w="120" w:type="dxa"/>
+            </w:tcMar>
+          </w:tcPr>
+          <w:p>
+            <w:pPr>
+              <w:spacing w:after="0"/>
+            </w:pPr>
+            <w:r>
+              <w:rPr>
+                <w:rFonts w:ascii="Microsoft YaHei UI" w:hAnsi="Microsoft YaHei UI" w:eastAsia="Microsoft YaHei UI"/>
+                <w:sz w:val="19"/>
+              </w:rPr>
+              <w:t>每隔多少秒扫描一次，建议 60 秒</w:t>
+            </w:r>
+          </w:p>
+        </w:tc>
+      </w:tr>
     </w:tbl>
     <w:p/>
     <w:p/>
@@ -4671,25 +4821,31 @@
     <w:p/>
     <w:p>
       <w:pPr>
-        <w:pStyle w:val="Heading1"/>
-      </w:pPr>
-      <w:r>
-        <w:rPr>
-          <w:rFonts w:ascii="Microsoft YaHei UI" w:hAnsi="Microsoft YaHei UI" w:eastAsia="Microsoft YaHei UI"/>
-        </w:rPr>
-        <w:t>8. 日常操作步骤</w:t>
+        <w:pStyle w:val="Heading2"/>
+      </w:pPr>
+      <w:r>
+        <w:rPr>
+          <w:rFonts w:ascii="Microsoft YaHei UI" w:hAnsi="Microsoft YaHei UI" w:eastAsia="Microsoft YaHei UI"/>
+        </w:rPr>
+        <w:t>7.6 如何开启自动扫描</w:t>
       </w:r>
     </w:p>
     <w:p/>
     <w:p>
-      <w:pPr>
-        <w:pStyle w:val="Heading2"/>
-      </w:pPr>
-      <w:r>
-        <w:rPr>
-          <w:rFonts w:ascii="Microsoft YaHei UI" w:hAnsi="Microsoft YaHei UI" w:eastAsia="Microsoft YaHei UI"/>
-        </w:rPr>
-        <w:t>8.1 业务人员操作</w:t>
+      <w:r>
+        <w:rPr>
+          <w:rFonts w:ascii="Microsoft YaHei UI" w:hAnsi="Microsoft YaHei UI" w:eastAsia="Microsoft YaHei UI"/>
+        </w:rPr>
+        <w:t>建议正式使用时开启自动扫描。</w:t>
+      </w:r>
+    </w:p>
+    <w:p/>
+    <w:p>
+      <w:r>
+        <w:rPr>
+          <w:rFonts w:ascii="Microsoft YaHei UI" w:hAnsi="Microsoft YaHei UI" w:eastAsia="Microsoft YaHei UI"/>
+        </w:rPr>
+        <w:t>操作步骤：</w:t>
       </w:r>
     </w:p>
     <w:p/>
@@ -4702,55 +4858,7 @@
         <w:rPr>
           <w:rFonts w:ascii="Microsoft YaHei UI" w:hAnsi="Microsoft YaHei UI" w:eastAsia="Microsoft YaHei UI"/>
         </w:rPr>
-        <w:t>打开 Foxmail。</w:t>
-      </w:r>
-    </w:p>
-    <w:p>
-      <w:pPr>
-        <w:pStyle w:val="ListNumber"/>
-        <w:ind w:left="461"/>
-      </w:pPr>
-      <w:r>
-        <w:rPr>
-          <w:rFonts w:ascii="Microsoft YaHei UI" w:hAnsi="Microsoft YaHei UI" w:eastAsia="Microsoft YaHei UI"/>
-        </w:rPr>
-        <w:t>制作 Excel 发货单。</w:t>
-      </w:r>
-    </w:p>
-    <w:p>
-      <w:pPr>
-        <w:pStyle w:val="ListNumber"/>
-        <w:ind w:left="461"/>
-      </w:pPr>
-      <w:r>
-        <w:rPr>
-          <w:rFonts w:ascii="Microsoft YaHei UI" w:hAnsi="Microsoft YaHei UI" w:eastAsia="Microsoft YaHei UI"/>
-        </w:rPr>
-        <w:t>按客户要求命名文件。</w:t>
-      </w:r>
-    </w:p>
-    <w:p>
-      <w:pPr>
-        <w:pStyle w:val="ListNumber"/>
-        <w:ind w:left="461"/>
-      </w:pPr>
-      <w:r>
-        <w:rPr>
-          <w:rFonts w:ascii="Microsoft YaHei UI" w:hAnsi="Microsoft YaHei UI" w:eastAsia="Microsoft YaHei UI"/>
-        </w:rPr>
-        <w:t>保存到客户指定文件夹。</w:t>
-      </w:r>
-    </w:p>
-    <w:p>
-      <w:pPr>
-        <w:pStyle w:val="ListNumber"/>
-        <w:ind w:left="461"/>
-      </w:pPr>
-      <w:r>
-        <w:rPr>
-          <w:rFonts w:ascii="Microsoft YaHei UI" w:hAnsi="Microsoft YaHei UI" w:eastAsia="Microsoft YaHei UI"/>
-        </w:rPr>
-        <w:t>打开工具窗口，或确认工具已自动启动。</w:t>
+        <w:t>打开工具。</w:t>
       </w:r>
     </w:p>
     <w:p>
@@ -4770,13 +4878,13 @@
           <w:color w:val="464646"/>
           <w:sz w:val="19"/>
         </w:rPr>
-        <w:t>立即扫描并生成草稿</w:t>
-      </w:r>
-      <w:r>
-        <w:rPr>
-          <w:rFonts w:ascii="Microsoft YaHei UI" w:hAnsi="Microsoft YaHei UI" w:eastAsia="Microsoft YaHei UI"/>
-        </w:rPr>
-        <w:t>。</w:t>
+        <w:t>系统设置</w:t>
+      </w:r>
+      <w:r>
+        <w:rPr>
+          <w:rFonts w:ascii="Microsoft YaHei UI" w:hAnsi="Microsoft YaHei UI" w:eastAsia="Microsoft YaHei UI"/>
+        </w:rPr>
+        <w:t xml:space="preserve"> 页签。</w:t>
       </w:r>
     </w:p>
     <w:p>
@@ -4788,7 +4896,295 @@
         <w:rPr>
           <w:rFonts w:ascii="Microsoft YaHei UI" w:hAnsi="Microsoft YaHei UI" w:eastAsia="Microsoft YaHei UI"/>
         </w:rPr>
-        <w:t>等待界面提示扫描完成。</w:t>
+        <w:t xml:space="preserve">勾选 </w:t>
+      </w:r>
+      <w:r>
+        <w:rPr>
+          <w:rFonts w:ascii="Consolas" w:hAnsi="Consolas" w:eastAsia="Consolas"/>
+          <w:color w:val="464646"/>
+          <w:sz w:val="19"/>
+        </w:rPr>
+        <w:t>自动扫描客户文件夹</w:t>
+      </w:r>
+      <w:r>
+        <w:rPr>
+          <w:rFonts w:ascii="Microsoft YaHei UI" w:hAnsi="Microsoft YaHei UI" w:eastAsia="Microsoft YaHei UI"/>
+        </w:rPr>
+        <w:t>。</w:t>
+      </w:r>
+    </w:p>
+    <w:p>
+      <w:pPr>
+        <w:pStyle w:val="ListNumber"/>
+        <w:ind w:left="461"/>
+      </w:pPr>
+      <w:r>
+        <w:rPr>
+          <w:rFonts w:ascii="Microsoft YaHei UI" w:hAnsi="Microsoft YaHei UI" w:eastAsia="Microsoft YaHei UI"/>
+        </w:rPr>
+        <w:t xml:space="preserve">将 </w:t>
+      </w:r>
+      <w:r>
+        <w:rPr>
+          <w:rFonts w:ascii="Consolas" w:hAnsi="Consolas" w:eastAsia="Consolas"/>
+          <w:color w:val="464646"/>
+          <w:sz w:val="19"/>
+        </w:rPr>
+        <w:t>扫描间隔秒数</w:t>
+      </w:r>
+      <w:r>
+        <w:rPr>
+          <w:rFonts w:ascii="Microsoft YaHei UI" w:hAnsi="Microsoft YaHei UI" w:eastAsia="Microsoft YaHei UI"/>
+        </w:rPr>
+        <w:t xml:space="preserve"> 设置为 </w:t>
+      </w:r>
+      <w:r>
+        <w:rPr>
+          <w:rFonts w:ascii="Consolas" w:hAnsi="Consolas" w:eastAsia="Consolas"/>
+          <w:color w:val="464646"/>
+          <w:sz w:val="19"/>
+        </w:rPr>
+        <w:t>60</w:t>
+      </w:r>
+      <w:r>
+        <w:rPr>
+          <w:rFonts w:ascii="Microsoft YaHei UI" w:hAnsi="Microsoft YaHei UI" w:eastAsia="Microsoft YaHei UI"/>
+        </w:rPr>
+        <w:t>。</w:t>
+      </w:r>
+    </w:p>
+    <w:p>
+      <w:pPr>
+        <w:pStyle w:val="ListNumber"/>
+        <w:ind w:left="461"/>
+      </w:pPr>
+      <w:r>
+        <w:rPr>
+          <w:rFonts w:ascii="Microsoft YaHei UI" w:hAnsi="Microsoft YaHei UI" w:eastAsia="Microsoft YaHei UI"/>
+        </w:rPr>
+        <w:t xml:space="preserve">点击 </w:t>
+      </w:r>
+      <w:r>
+        <w:rPr>
+          <w:rFonts w:ascii="Consolas" w:hAnsi="Consolas" w:eastAsia="Consolas"/>
+          <w:color w:val="464646"/>
+          <w:sz w:val="19"/>
+        </w:rPr>
+        <w:t>保存系统设置</w:t>
+      </w:r>
+      <w:r>
+        <w:rPr>
+          <w:rFonts w:ascii="Microsoft YaHei UI" w:hAnsi="Microsoft YaHei UI" w:eastAsia="Microsoft YaHei UI"/>
+        </w:rPr>
+        <w:t>。</w:t>
+      </w:r>
+    </w:p>
+    <w:p/>
+    <w:p>
+      <w:r>
+        <w:rPr>
+          <w:rFonts w:ascii="Microsoft YaHei UI" w:hAnsi="Microsoft YaHei UI" w:eastAsia="Microsoft YaHei UI"/>
+        </w:rPr>
+        <w:t>开启后，业务人员将 Excel 保存到客户文件夹后，不需要手动点击扫描。工具会按设置的间隔自动扫描。</w:t>
+      </w:r>
+    </w:p>
+    <w:p/>
+    <w:p>
+      <w:r>
+        <w:rPr>
+          <w:rFonts w:ascii="Microsoft YaHei UI" w:hAnsi="Microsoft YaHei UI" w:eastAsia="Microsoft YaHei UI"/>
+        </w:rPr>
+        <w:t>说明：</w:t>
+      </w:r>
+    </w:p>
+    <w:p/>
+    <w:p>
+      <w:pPr>
+        <w:spacing w:after="20"/>
+        <w:ind w:left="259" w:right="173"/>
+      </w:pPr>
+      <w:r>
+        <w:rPr>
+          <w:rFonts w:ascii="Consolas" w:hAnsi="Consolas" w:eastAsia="Consolas"/>
+          <w:color w:val="2D2D2D"/>
+          <w:sz w:val="18"/>
+        </w:rPr>
+        <w:t>如果上一轮扫描还没有完成，下一轮不会重复启动。</w:t>
+      </w:r>
+    </w:p>
+    <w:p/>
+    <w:p>
+      <w:r>
+        <w:rPr>
+          <w:rFonts w:ascii="Microsoft YaHei UI" w:hAnsi="Microsoft YaHei UI" w:eastAsia="Microsoft YaHei UI"/>
+        </w:rPr>
+        <w:t>建议：</w:t>
+      </w:r>
+    </w:p>
+    <w:p/>
+    <w:p>
+      <w:pPr>
+        <w:spacing w:after="20"/>
+        <w:ind w:left="259" w:right="173"/>
+      </w:pPr>
+      <w:r>
+        <w:rPr>
+          <w:rFonts w:ascii="Consolas" w:hAnsi="Consolas" w:eastAsia="Consolas"/>
+          <w:color w:val="2D2D2D"/>
+          <w:sz w:val="18"/>
+        </w:rPr>
+        <w:t>普通业务电脑：60 秒</w:t>
+      </w:r>
+    </w:p>
+    <w:p>
+      <w:pPr>
+        <w:spacing w:after="20"/>
+        <w:ind w:left="259" w:right="173"/>
+      </w:pPr>
+      <w:r>
+        <w:rPr>
+          <w:rFonts w:ascii="Consolas" w:hAnsi="Consolas" w:eastAsia="Consolas"/>
+          <w:color w:val="2D2D2D"/>
+          <w:sz w:val="18"/>
+        </w:rPr>
+        <w:t>发货频率很高：30 秒</w:t>
+      </w:r>
+    </w:p>
+    <w:p>
+      <w:pPr>
+        <w:spacing w:after="20"/>
+        <w:ind w:left="259" w:right="173"/>
+      </w:pPr>
+      <w:r>
+        <w:rPr>
+          <w:rFonts w:ascii="Consolas" w:hAnsi="Consolas" w:eastAsia="Consolas"/>
+          <w:color w:val="2D2D2D"/>
+          <w:sz w:val="18"/>
+        </w:rPr>
+        <w:t>不建议低于 10 秒</w:t>
+      </w:r>
+    </w:p>
+    <w:p/>
+    <w:p>
+      <w:pPr>
+        <w:pStyle w:val="Heading1"/>
+      </w:pPr>
+      <w:r>
+        <w:rPr>
+          <w:rFonts w:ascii="Microsoft YaHei UI" w:hAnsi="Microsoft YaHei UI" w:eastAsia="Microsoft YaHei UI"/>
+        </w:rPr>
+        <w:t>8. 日常操作步骤</w:t>
+      </w:r>
+    </w:p>
+    <w:p/>
+    <w:p>
+      <w:pPr>
+        <w:pStyle w:val="Heading2"/>
+      </w:pPr>
+      <w:r>
+        <w:rPr>
+          <w:rFonts w:ascii="Microsoft YaHei UI" w:hAnsi="Microsoft YaHei UI" w:eastAsia="Microsoft YaHei UI"/>
+        </w:rPr>
+        <w:t>8.1 业务人员操作</w:t>
+      </w:r>
+    </w:p>
+    <w:p/>
+    <w:p>
+      <w:pPr>
+        <w:pStyle w:val="ListNumber"/>
+        <w:ind w:left="461"/>
+      </w:pPr>
+      <w:r>
+        <w:rPr>
+          <w:rFonts w:ascii="Microsoft YaHei UI" w:hAnsi="Microsoft YaHei UI" w:eastAsia="Microsoft YaHei UI"/>
+        </w:rPr>
+        <w:t>打开 Foxmail。</w:t>
+      </w:r>
+    </w:p>
+    <w:p>
+      <w:pPr>
+        <w:pStyle w:val="ListNumber"/>
+        <w:ind w:left="461"/>
+      </w:pPr>
+      <w:r>
+        <w:rPr>
+          <w:rFonts w:ascii="Microsoft YaHei UI" w:hAnsi="Microsoft YaHei UI" w:eastAsia="Microsoft YaHei UI"/>
+        </w:rPr>
+        <w:t>制作 Excel 发货单。</w:t>
+      </w:r>
+    </w:p>
+    <w:p>
+      <w:pPr>
+        <w:pStyle w:val="ListNumber"/>
+        <w:ind w:left="461"/>
+      </w:pPr>
+      <w:r>
+        <w:rPr>
+          <w:rFonts w:ascii="Microsoft YaHei UI" w:hAnsi="Microsoft YaHei UI" w:eastAsia="Microsoft YaHei UI"/>
+        </w:rPr>
+        <w:t>按客户要求命名文件。</w:t>
+      </w:r>
+    </w:p>
+    <w:p>
+      <w:pPr>
+        <w:pStyle w:val="ListNumber"/>
+        <w:ind w:left="461"/>
+      </w:pPr>
+      <w:r>
+        <w:rPr>
+          <w:rFonts w:ascii="Microsoft YaHei UI" w:hAnsi="Microsoft YaHei UI" w:eastAsia="Microsoft YaHei UI"/>
+        </w:rPr>
+        <w:t>保存到客户指定文件夹。</w:t>
+      </w:r>
+    </w:p>
+    <w:p>
+      <w:pPr>
+        <w:pStyle w:val="ListNumber"/>
+        <w:ind w:left="461"/>
+      </w:pPr>
+      <w:r>
+        <w:rPr>
+          <w:rFonts w:ascii="Microsoft YaHei UI" w:hAnsi="Microsoft YaHei UI" w:eastAsia="Microsoft YaHei UI"/>
+        </w:rPr>
+        <w:t>打开工具窗口，或确认工具已自动启动。</w:t>
+      </w:r>
+    </w:p>
+    <w:p>
+      <w:pPr>
+        <w:pStyle w:val="ListNumber"/>
+        <w:ind w:left="461"/>
+      </w:pPr>
+      <w:r>
+        <w:rPr>
+          <w:rFonts w:ascii="Microsoft YaHei UI" w:hAnsi="Microsoft YaHei UI" w:eastAsia="Microsoft YaHei UI"/>
+        </w:rPr>
+        <w:t>如果已开启自动扫描，可等待工具自动处理。</w:t>
+      </w:r>
+    </w:p>
+    <w:p>
+      <w:pPr>
+        <w:pStyle w:val="ListNumber"/>
+        <w:ind w:left="461"/>
+      </w:pPr>
+      <w:r>
+        <w:rPr>
+          <w:rFonts w:ascii="Microsoft YaHei UI" w:hAnsi="Microsoft YaHei UI" w:eastAsia="Microsoft YaHei UI"/>
+        </w:rPr>
+        <w:t xml:space="preserve">如需立即处理，可点击 </w:t>
+      </w:r>
+      <w:r>
+        <w:rPr>
+          <w:rFonts w:ascii="Consolas" w:hAnsi="Consolas" w:eastAsia="Consolas"/>
+          <w:color w:val="464646"/>
+          <w:sz w:val="19"/>
+        </w:rPr>
+        <w:t>立即扫描并生成草稿</w:t>
+      </w:r>
+      <w:r>
+        <w:rPr>
+          <w:rFonts w:ascii="Microsoft YaHei UI" w:hAnsi="Microsoft YaHei UI" w:eastAsia="Microsoft YaHei UI"/>
+        </w:rPr>
+        <w:t>。</w:t>
       </w:r>
     </w:p>
     <w:p>

</xml_diff>

<commit_message>
Prevent repeated drafts during auto scan
</commit_message>
<xml_diff>
--- a/doc/使用说明书.docx
+++ b/doc/使用说明书.docx
@@ -5968,7 +5968,7 @@
         <w:rPr>
           <w:rFonts w:ascii="Microsoft YaHei UI" w:hAnsi="Microsoft YaHei UI" w:eastAsia="Microsoft YaHei UI"/>
         </w:rPr>
-        <w:t>同一个 Excel 文件如果内容没有变化，再次运行工具时不会重复生成草稿。</w:t>
+        <w:t>同一个 Excel 文件路径如果已经处理过，再次自动扫描时不会重复生成草稿。</w:t>
       </w:r>
     </w:p>
     <w:p/>
@@ -5986,7 +5986,40 @@
         <w:rPr>
           <w:rFonts w:ascii="Microsoft YaHei UI" w:hAnsi="Microsoft YaHei UI" w:eastAsia="Microsoft YaHei UI"/>
         </w:rPr>
-        <w:t>如果 Excel 内容修改过，工具会认为这是新版本，可以重新生成草稿。</w:t>
+        <w:t>当前默认策略是：</w:t>
+      </w:r>
+    </w:p>
+    <w:p/>
+    <w:p>
+      <w:pPr>
+        <w:spacing w:after="20"/>
+        <w:ind w:left="259" w:right="173"/>
+      </w:pPr>
+      <w:r>
+        <w:rPr>
+          <w:rFonts w:ascii="Consolas" w:hAnsi="Consolas" w:eastAsia="Consolas"/>
+          <w:color w:val="2D2D2D"/>
+          <w:sz w:val="18"/>
+        </w:rPr>
+        <w:t>同一路径只自动生成一次草稿。</w:t>
+      </w:r>
+    </w:p>
+    <w:p/>
+    <w:p>
+      <w:r>
+        <w:rPr>
+          <w:rFonts w:ascii="Microsoft YaHei UI" w:hAnsi="Microsoft YaHei UI" w:eastAsia="Microsoft YaHei UI"/>
+        </w:rPr>
+        <w:t>也就是说，即使同一个 Excel 后续又被保存了一次，自动扫描也不会再次生成同主题草稿。</w:t>
+      </w:r>
+    </w:p>
+    <w:p/>
+    <w:p>
+      <w:r>
+        <w:rPr>
+          <w:rFonts w:ascii="Microsoft YaHei UI" w:hAnsi="Microsoft YaHei UI" w:eastAsia="Microsoft YaHei UI"/>
+        </w:rPr>
+        <w:t>如果确实需要重新生成，请将 Excel 另存为新的文件名，或联系维护人员处理。</w:t>
       </w:r>
     </w:p>
     <w:p/>

</xml_diff>

<commit_message>
Use scan cursor for auto draft dedupe
</commit_message>
<xml_diff>
--- a/doc/使用说明书.docx
+++ b/doc/使用说明书.docx
@@ -5968,7 +5968,7 @@
         <w:rPr>
           <w:rFonts w:ascii="Microsoft YaHei UI" w:hAnsi="Microsoft YaHei UI" w:eastAsia="Microsoft YaHei UI"/>
         </w:rPr>
-        <w:t>同一个 Excel 文件路径如果已经处理过，再次自动扫描时不会重复生成草稿。</w:t>
+        <w:t>自动扫描采用增量扫描策略，不会把同一份未变化的 Excel 反复生成草稿。</w:t>
       </w:r>
     </w:p>
     <w:p/>
@@ -5977,16 +5977,7 @@
         <w:rPr>
           <w:rFonts w:ascii="Microsoft YaHei UI" w:hAnsi="Microsoft YaHei UI" w:eastAsia="Microsoft YaHei UI"/>
         </w:rPr>
-        <w:t>这是为了避免 Foxmail 草稿箱中出现多封重复邮件。</w:t>
-      </w:r>
-    </w:p>
-    <w:p/>
-    <w:p>
-      <w:r>
-        <w:rPr>
-          <w:rFonts w:ascii="Microsoft YaHei UI" w:hAnsi="Microsoft YaHei UI" w:eastAsia="Microsoft YaHei UI"/>
-        </w:rPr>
-        <w:t>当前默认策略是：</w:t>
+        <w:t>判断逻辑是：</w:t>
       </w:r>
     </w:p>
     <w:p/>
@@ -6001,7 +5992,91 @@
           <w:color w:val="2D2D2D"/>
           <w:sz w:val="18"/>
         </w:rPr>
-        <w:t>同一路径只自动生成一次草稿。</w:t>
+        <w:t>文件最后修改时间 &gt; 上次扫描时间</w:t>
+      </w:r>
+    </w:p>
+    <w:p>
+      <w:pPr>
+        <w:spacing w:after="20"/>
+        <w:ind w:left="259" w:right="173"/>
+      </w:pPr>
+      <w:r>
+        <w:rPr>
+          <w:rFonts w:ascii="Consolas" w:hAnsi="Consolas" w:eastAsia="Consolas"/>
+          <w:color w:val="2D2D2D"/>
+          <w:sz w:val="18"/>
+        </w:rPr>
+        <w:t xml:space="preserve">        ↓</w:t>
+      </w:r>
+    </w:p>
+    <w:p>
+      <w:pPr>
+        <w:spacing w:after="20"/>
+        <w:ind w:left="259" w:right="173"/>
+      </w:pPr>
+      <w:r>
+        <w:rPr>
+          <w:rFonts w:ascii="Consolas" w:hAnsi="Consolas" w:eastAsia="Consolas"/>
+          <w:color w:val="2D2D2D"/>
+          <w:sz w:val="18"/>
+        </w:rPr>
+        <w:t>文件稳定且未被 Excel 占用</w:t>
+      </w:r>
+    </w:p>
+    <w:p>
+      <w:pPr>
+        <w:spacing w:after="20"/>
+        <w:ind w:left="259" w:right="173"/>
+      </w:pPr>
+      <w:r>
+        <w:rPr>
+          <w:rFonts w:ascii="Consolas" w:hAnsi="Consolas" w:eastAsia="Consolas"/>
+          <w:color w:val="2D2D2D"/>
+          <w:sz w:val="18"/>
+        </w:rPr>
+        <w:t xml:space="preserve">        ↓</w:t>
+      </w:r>
+    </w:p>
+    <w:p>
+      <w:pPr>
+        <w:spacing w:after="20"/>
+        <w:ind w:left="259" w:right="173"/>
+      </w:pPr>
+      <w:r>
+        <w:rPr>
+          <w:rFonts w:ascii="Consolas" w:hAnsi="Consolas" w:eastAsia="Consolas"/>
+          <w:color w:val="2D2D2D"/>
+          <w:sz w:val="18"/>
+        </w:rPr>
+        <w:t>file_path + file_size + file_mtime 未处理过</w:t>
+      </w:r>
+    </w:p>
+    <w:p>
+      <w:pPr>
+        <w:spacing w:after="20"/>
+        <w:ind w:left="259" w:right="173"/>
+      </w:pPr>
+      <w:r>
+        <w:rPr>
+          <w:rFonts w:ascii="Consolas" w:hAnsi="Consolas" w:eastAsia="Consolas"/>
+          <w:color w:val="2D2D2D"/>
+          <w:sz w:val="18"/>
+        </w:rPr>
+        <w:t xml:space="preserve">        ↓</w:t>
+      </w:r>
+    </w:p>
+    <w:p>
+      <w:pPr>
+        <w:spacing w:after="20"/>
+        <w:ind w:left="259" w:right="173"/>
+      </w:pPr>
+      <w:r>
+        <w:rPr>
+          <w:rFonts w:ascii="Consolas" w:hAnsi="Consolas" w:eastAsia="Consolas"/>
+          <w:color w:val="2D2D2D"/>
+          <w:sz w:val="18"/>
+        </w:rPr>
+        <w:t>生成草稿</w:t>
       </w:r>
     </w:p>
     <w:p/>
@@ -6010,16 +6085,82 @@
         <w:rPr>
           <w:rFonts w:ascii="Microsoft YaHei UI" w:hAnsi="Microsoft YaHei UI" w:eastAsia="Microsoft YaHei UI"/>
         </w:rPr>
-        <w:t>也就是说，即使同一个 Excel 后续又被保存了一次，自动扫描也不会再次生成同主题草稿。</w:t>
+        <w:t>这样可以同时满足：</w:t>
       </w:r>
     </w:p>
     <w:p/>
     <w:p>
-      <w:r>
-        <w:rPr>
-          <w:rFonts w:ascii="Microsoft YaHei UI" w:hAnsi="Microsoft YaHei UI" w:eastAsia="Microsoft YaHei UI"/>
-        </w:rPr>
-        <w:t>如果确实需要重新生成，请将 Excel 另存为新的文件名，或联系维护人员处理。</w:t>
+      <w:pPr>
+        <w:spacing w:after="20"/>
+        <w:ind w:left="259" w:right="173"/>
+      </w:pPr>
+      <w:r>
+        <w:rPr>
+          <w:rFonts w:ascii="Consolas" w:hAnsi="Consolas" w:eastAsia="Consolas"/>
+          <w:color w:val="2D2D2D"/>
+          <w:sz w:val="18"/>
+        </w:rPr>
+        <w:t>同一份未变化 Excel：不重复生成</w:t>
+      </w:r>
+    </w:p>
+    <w:p>
+      <w:pPr>
+        <w:spacing w:after="20"/>
+        <w:ind w:left="259" w:right="173"/>
+      </w:pPr>
+      <w:r>
+        <w:rPr>
+          <w:rFonts w:ascii="Consolas" w:hAnsi="Consolas" w:eastAsia="Consolas"/>
+          <w:color w:val="2D2D2D"/>
+          <w:sz w:val="18"/>
+        </w:rPr>
+        <w:t>同一份 Excel 内容修改并保存：允许生成新版本草稿</w:t>
+      </w:r>
+    </w:p>
+    <w:p>
+      <w:pPr>
+        <w:spacing w:after="20"/>
+        <w:ind w:left="259" w:right="173"/>
+      </w:pPr>
+      <w:r>
+        <w:rPr>
+          <w:rFonts w:ascii="Consolas" w:hAnsi="Consolas" w:eastAsia="Consolas"/>
+          <w:color w:val="2D2D2D"/>
+          <w:sz w:val="18"/>
+        </w:rPr>
+        <w:t>Excel 正在编辑或保存中：暂不处理，下一轮再判断</w:t>
+      </w:r>
+    </w:p>
+    <w:p>
+      <w:pPr>
+        <w:spacing w:after="20"/>
+        <w:ind w:left="259" w:right="173"/>
+      </w:pPr>
+      <w:r>
+        <w:rPr>
+          <w:rFonts w:ascii="Consolas" w:hAnsi="Consolas" w:eastAsia="Consolas"/>
+          <w:color w:val="2D2D2D"/>
+          <w:sz w:val="18"/>
+        </w:rPr>
+        <w:t>导入失败的同一版本：不自动无限重试</w:t>
+      </w:r>
+    </w:p>
+    <w:p/>
+    <w:p>
+      <w:r>
+        <w:rPr>
+          <w:rFonts w:ascii="Microsoft YaHei UI" w:hAnsi="Microsoft YaHei UI" w:eastAsia="Microsoft YaHei UI"/>
+        </w:rPr>
+        <w:t>如果只是打开文件又保存，但内容没有变化，工具会通过文件 Hash 再挡一次，避免无意义重复。</w:t>
+      </w:r>
+    </w:p>
+    <w:p/>
+    <w:p>
+      <w:r>
+        <w:rPr>
+          <w:rFonts w:ascii="Microsoft YaHei UI" w:hAnsi="Microsoft YaHei UI" w:eastAsia="Microsoft YaHei UI"/>
+        </w:rPr>
+        <w:t>如果确实需要重新生成同一内容的草稿，建议另存为新的 Excel 文件名。</w:t>
       </w:r>
     </w:p>
     <w:p/>

</xml_diff>